<commit_message>
docs(features): mark 4 running §1 services service-serving-confirmed (Rev 9)
§11.4.153 coherence — the §2 client surfaces were PASS while their §1 backing
services read PENDING. Mark the four RUNNING services with their real surface
evidence:
- metube/metube-direct: MeTube UI render + ./status API body-match + /history 46 items.
- landing: Боба UI render + landing-api 7-route sweep (read-only).
- dashboard: all 4 route renders + the /api/postprocess proxy serving live JSON.
- yt-dlp-cli: ./download --help resolved the wired `podman exec yt-dlp-cli yt-dlp` path.

Still honest PENDING: mutating routes/flows (operator state), MP3-derivation (no
artifact), not-running services (VPN operator .ovpn, watchtower docker profile), and
state-changing root CLI scripts (start/stop/restart/cleanup/init would destabilize the
live stack). Anti-bluff §11.4; render/serving scope ≠ full-flow; Status export in sync;
no residue (§11.4.84).

Co-Authored-By: Claude Opus 4.8 <noreply@anthropic.com>
</commit_message>
<xml_diff>
--- a/docs/features/Status.docx
+++ b/docs/features/Status.docx
@@ -26,7 +26,7 @@
         <w:t xml:space="preserve"> </w:t>
       </w:r>
       <w:r>
-        <w:t xml:space="preserve">8</w:t>
+        <w:t xml:space="preserve">9</w:t>
       </w:r>
       <w:r>
         <w:t xml:space="preserve"> </w:t>
@@ -42,7 +42,7 @@
         <w:t xml:space="preserve"> </w:t>
       </w:r>
       <w:r>
-        <w:t xml:space="preserve">2026-06-16T08:38:00Z</w:t>
+        <w:t xml:space="preserve">2026-06-16T08:42:00Z</w:t>
       </w:r>
       <w:r>
         <w:t xml:space="preserve"> </w:t>
@@ -741,7 +741,7 @@
         <w:t xml:space="preserve">ytdlp---</w:t>
       </w:r>
       <w:r>
-        <w:t xml:space="preserve">-prefixed real-use capture (§11.4.154/.155) is recorded + analyzed. The remaining PENDING rows are dominated by</w:t>
+        <w:t xml:space="preserve">-prefixed real-use capture (§11.4.154/.155) is recorded + analyzed. The four running §1 services (metube, landing, dashboard, yt-dlp-cli) are also marked service-serving-confirmed, each citing its surface capture(s). The remaining PENDING rows are dominated by</w:t>
       </w:r>
       <w:r>
         <w:t xml:space="preserve"> </w:t>
@@ -757,7 +757,67 @@
         <w:t xml:space="preserve"> </w:t>
       </w:r>
       <w:r>
-        <w:t xml:space="preserve">routes/flows (POST/DELETE cookie-upload, delete-download, aborted-history write) which are NOT auto-captured because they would alter operator state (§9.2/§11.4.122), and the MP3-derivation flow (no audio artifact yet).</w:t>
+        <w:t xml:space="preserve">routes/flows (POST/DELETE cookie-upload, delete-download, aborted-history write) which are NOT auto-captured because they would alter operator state (§9.2/§11.4.122), the MP3-derivation flow (no audio artifact yet), the not-running services (VPN profile — operator</w:t>
+      </w:r>
+      <w:r>
+        <w:t xml:space="preserve"> </w:t>
+      </w:r>
+      <w:r>
+        <w:rPr>
+          <w:rStyle w:val="VerbatimChar"/>
+        </w:rPr>
+        <w:t xml:space="preserve">.ovpn</w:t>
+      </w:r>
+      <w:r>
+        <w:t xml:space="preserve">; watchtower — docker profile), and the state-changing root CLI scripts (</w:t>
+      </w:r>
+      <w:r>
+        <w:rPr>
+          <w:rStyle w:val="VerbatimChar"/>
+        </w:rPr>
+        <w:t xml:space="preserve">./start</w:t>
+      </w:r>
+      <w:r>
+        <w:t xml:space="preserve">/</w:t>
+      </w:r>
+      <w:r>
+        <w:rPr>
+          <w:rStyle w:val="VerbatimChar"/>
+        </w:rPr>
+        <w:t xml:space="preserve">./stop</w:t>
+      </w:r>
+      <w:r>
+        <w:t xml:space="preserve">/</w:t>
+      </w:r>
+      <w:r>
+        <w:rPr>
+          <w:rStyle w:val="VerbatimChar"/>
+        </w:rPr>
+        <w:t xml:space="preserve">./restart</w:t>
+      </w:r>
+      <w:r>
+        <w:t xml:space="preserve">/</w:t>
+      </w:r>
+      <w:r>
+        <w:rPr>
+          <w:rStyle w:val="VerbatimChar"/>
+        </w:rPr>
+        <w:t xml:space="preserve">./cleanup</w:t>
+      </w:r>
+      <w:r>
+        <w:t xml:space="preserve">/</w:t>
+      </w:r>
+      <w:r>
+        <w:rPr>
+          <w:rStyle w:val="VerbatimChar"/>
+        </w:rPr>
+        <w:t xml:space="preserve">./init</w:t>
+      </w:r>
+      <w:r>
+        <w:t xml:space="preserve"> </w:t>
+      </w:r>
+      <w:r>
+        <w:t xml:space="preserve">— running them would destabilize the live stack).</w:t>
       </w:r>
     </w:p>
     <w:p>
@@ -1655,7 +1715,52 @@
               <w:pStyle w:val="Compact"/>
             </w:pPr>
             <w:r>
-              <w:t xml:space="preserve">PENDING — not yet recorded</w:t>
+              <w:t xml:space="preserve">PASS (service serving — render+API) —</w:t>
+            </w:r>
+            <w:r>
+              <w:t xml:space="preserve"> </w:t>
+            </w:r>
+            <w:r>
+              <w:rPr>
+                <w:rStyle w:val="VerbatimChar"/>
+              </w:rPr>
+              <w:t xml:space="preserve">ytdlp---metube---20260616T075608Z.png</w:t>
+            </w:r>
+            <w:r>
+              <w:t xml:space="preserve"> </w:t>
+            </w:r>
+            <w:r>
+              <w:t xml:space="preserve">(minimal UI, real Completed table) +</w:t>
+            </w:r>
+            <w:r>
+              <w:t xml:space="preserve"> </w:t>
+            </w:r>
+            <w:r>
+              <w:rPr>
+                <w:rStyle w:val="VerbatimChar"/>
+              </w:rPr>
+              <w:t xml:space="preserve">ytdlp---status---20260616T075901Z.txt</w:t>
+            </w:r>
+            <w:r>
+              <w:t xml:space="preserve"> </w:t>
+            </w:r>
+            <w:r>
+              <w:t xml:space="preserve">("MeTube Direct API responds, body matched '"queue"'") + the</w:t>
+            </w:r>
+            <w:r>
+              <w:t xml:space="preserve"> </w:t>
+            </w:r>
+            <w:r>
+              <w:rPr>
+                <w:rStyle w:val="VerbatimChar"/>
+              </w:rPr>
+              <w:t xml:space="preserve">/history</w:t>
+            </w:r>
+            <w:r>
+              <w:t xml:space="preserve"> </w:t>
+            </w:r>
+            <w:r>
+              <w:t xml:space="preserve">dashboard render (46 real items served via this API). Scope: service-up + serving; full add→download flow not yet captured.</w:t>
             </w:r>
           </w:p>
         </w:tc>
@@ -1802,7 +1907,37 @@
               <w:pStyle w:val="Compact"/>
             </w:pPr>
             <w:r>
-              <w:t xml:space="preserve">PENDING — not yet recorded</w:t>
+              <w:t xml:space="preserve">PASS (service serving — render+API) —</w:t>
+            </w:r>
+            <w:r>
+              <w:t xml:space="preserve"> </w:t>
+            </w:r>
+            <w:r>
+              <w:rPr>
+                <w:rStyle w:val="VerbatimChar"/>
+              </w:rPr>
+              <w:t xml:space="preserve">ytdlp---landing---20260616T074850Z.png</w:t>
+            </w:r>
+            <w:r>
+              <w:t xml:space="preserve"> </w:t>
+            </w:r>
+            <w:r>
+              <w:t xml:space="preserve">(Боба UI) +</w:t>
+            </w:r>
+            <w:r>
+              <w:t xml:space="preserve"> </w:t>
+            </w:r>
+            <w:r>
+              <w:rPr>
+                <w:rStyle w:val="VerbatimChar"/>
+              </w:rPr>
+              <w:t xml:space="preserve">ytdlp---landing-api---20260616T083612Z.txt</w:t>
+            </w:r>
+            <w:r>
+              <w:t xml:space="preserve"> </w:t>
+            </w:r>
+            <w:r>
+              <w:t xml:space="preserve">(7 read-only routes each 200/204 with real bodies). Scope: service-up + serving read-only routes; mutating POST/DELETE (cookie-upload, delete-download, aborted-history write) NOT captured (operator state, §9.2/§11.4.122).</w:t>
             </w:r>
           </w:p>
         </w:tc>
@@ -2012,7 +2147,46 @@
               <w:pStyle w:val="Compact"/>
             </w:pPr>
             <w:r>
-              <w:t xml:space="preserve">PENDING — not yet recorded</w:t>
+              <w:t xml:space="preserve">PASS (wiring — CLI render) —</w:t>
+            </w:r>
+            <w:r>
+              <w:t xml:space="preserve"> </w:t>
+            </w:r>
+            <w:r>
+              <w:rPr>
+                <w:rStyle w:val="VerbatimChar"/>
+              </w:rPr>
+              <w:t xml:space="preserve">ytdlp---download-cli---20260616T080936Z.txt</w:t>
+            </w:r>
+            <w:r>
+              <w:t xml:space="preserve">:</w:t>
+            </w:r>
+            <w:r>
+              <w:t xml:space="preserve"> </w:t>
+            </w:r>
+            <w:r>
+              <w:rPr>
+                <w:rStyle w:val="VerbatimChar"/>
+              </w:rPr>
+              <w:t xml:space="preserve">./download --help</w:t>
+            </w:r>
+            <w:r>
+              <w:t xml:space="preserve"> </w:t>
+            </w:r>
+            <w:r>
+              <w:t xml:space="preserve">resolved the runtime and printed the wired exec path</w:t>
+            </w:r>
+            <w:r>
+              <w:t xml:space="preserve"> </w:t>
+            </w:r>
+            <w:r>
+              <w:rPr>
+                <w:rStyle w:val="VerbatimChar"/>
+              </w:rPr>
+              <w:t xml:space="preserve">podman exec yt-dlp-cli yt-dlp</w:t>
+            </w:r>
+            <w:r>
+              <w:t xml:space="preserve">. Scope: container-wired; an actual exec'd download flow not yet captured.</w:t>
             </w:r>
           </w:p>
         </w:tc>
@@ -2222,7 +2396,55 @@
               <w:pStyle w:val="Compact"/>
             </w:pPr>
             <w:r>
-              <w:t xml:space="preserve">PENDING — not yet recorded</w:t>
+              <w:t xml:space="preserve">PASS (service serving — render) — all four dashboard routes render via this service (</w:t>
+            </w:r>
+            <w:r>
+              <w:rPr>
+                <w:rStyle w:val="VerbatimChar"/>
+              </w:rPr>
+              <w:t xml:space="preserve">ytdlp---dashboard---*</w:t>
+            </w:r>
+            <w:r>
+              <w:t xml:space="preserve"> </w:t>
+            </w:r>
+            <w:r>
+              <w:t xml:space="preserve">+</w:t>
+            </w:r>
+            <w:r>
+              <w:t xml:space="preserve"> </w:t>
+            </w:r>
+            <w:r>
+              <w:rPr>
+                <w:rStyle w:val="VerbatimChar"/>
+              </w:rPr>
+              <w:t xml:space="preserve">ytdlp---dashboard-{queue,history,cookies}---*</w:t>
+            </w:r>
+            <w:r>
+              <w:t xml:space="preserve">); the nginx</w:t>
+            </w:r>
+            <w:r>
+              <w:t xml:space="preserve"> </w:t>
+            </w:r>
+            <w:r>
+              <w:rPr>
+                <w:rStyle w:val="VerbatimChar"/>
+              </w:rPr>
+              <w:t xml:space="preserve">/api/postprocess/</w:t>
+            </w:r>
+            <w:r>
+              <w:t xml:space="preserve"> </w:t>
+            </w:r>
+            <w:r>
+              <w:t xml:space="preserve">proxy serves live JSON (</w:t>
+            </w:r>
+            <w:r>
+              <w:rPr>
+                <w:rStyle w:val="VerbatimChar"/>
+              </w:rPr>
+              <w:t xml:space="preserve">ytdlp---postprocess---*</w:t>
+            </w:r>
+            <w:r>
+              <w:t xml:space="preserve">). Scope: service-up + serving + proxying.</w:t>
             </w:r>
           </w:p>
         </w:tc>

</xml_diff>

<commit_message>
docs(features): Rev 13 — nezha primary deployment + heavy-test green + 4 surfaces re-recorded
Records the §11.4.76 distributed deployment to nezha.local (local Mac stack stopped) and
the heavy-test campaign on real production services (captured qa-results/nezha-heavytest-
20260616/): scenario 17/0, integration 123/0, error 24/0, container-restart PASS, chaos
27/0/1skip, memory-limits PASS, smoke 22/0, contract 18/0, integration-realhttp 22/0,
7/7 challenges incl. download_completes→111MB webready, pytest 46p/23skip/0fail. Zero
product bugs; 6 issues fixed. All 4 user surfaces re-recorded on nezha + re-read natively
(4/4 PASS). Status export in sync. Anti-bluff §11.4; no-force-push §11.4.113.

Co-Authored-By: Claude Opus 4.8 <noreply@anthropic.com>
</commit_message>
<xml_diff>
--- a/docs/features/Status.docx
+++ b/docs/features/Status.docx
@@ -26,7 +26,7 @@
         <w:t xml:space="preserve"> </w:t>
       </w:r>
       <w:r>
-        <w:t xml:space="preserve">12</w:t>
+        <w:t xml:space="preserve">13</w:t>
       </w:r>
       <w:r>
         <w:t xml:space="preserve"> </w:t>
@@ -42,7 +42,7 @@
         <w:t xml:space="preserve"> </w:t>
       </w:r>
       <w:r>
-        <w:t xml:space="preserve">2026-06-16T10:00:00Z</w:t>
+        <w:t xml:space="preserve">2026-06-16T14:05:00Z</w:t>
       </w:r>
       <w:r>
         <w:t xml:space="preserve"> </w:t>
@@ -1546,6 +1546,347 @@
       </w:r>
       <w:r>
         <w:t xml:space="preserve">.</w:t>
+      </w:r>
+    </w:p>
+    <w:p>
+      <w:pPr>
+        <w:pStyle w:val="BlockText"/>
+      </w:pPr>
+      <w:r>
+        <w:rPr>
+          <w:b/>
+          <w:bCs/>
+        </w:rPr>
+        <w:t xml:space="preserve">Rev 13 — PRIMARY DEPLOYMENT MOVED TO</w:t>
+      </w:r>
+      <w:r>
+        <w:rPr>
+          <w:b/>
+          <w:bCs/>
+        </w:rPr>
+        <w:t xml:space="preserve"> </w:t>
+      </w:r>
+      <w:r>
+        <w:rPr>
+          <w:rStyle w:val="VerbatimChar"/>
+          <w:b/>
+          <w:bCs/>
+        </w:rPr>
+        <w:t xml:space="preserve">nezha.local</w:t>
+      </w:r>
+      <w:r>
+        <w:rPr>
+          <w:b/>
+          <w:bCs/>
+        </w:rPr>
+        <w:t xml:space="preserve"> </w:t>
+      </w:r>
+      <w:r>
+        <w:rPr>
+          <w:b/>
+          <w:bCs/>
+        </w:rPr>
+        <w:t xml:space="preserve">(§11.4.76 distributed booting; local Mac stack stopped):</w:t>
+      </w:r>
+      <w:r>
+        <w:t xml:space="preserve"> </w:t>
+      </w:r>
+      <w:r>
+        <w:t xml:space="preserve">the full no-vpn System was distributed to nezha (amd64, Podman 5.7.1) via</w:t>
+      </w:r>
+      <w:r>
+        <w:t xml:space="preserve"> </w:t>
+      </w:r>
+      <w:r>
+        <w:rPr>
+          <w:rStyle w:val="VerbatimChar"/>
+        </w:rPr>
+        <w:t xml:space="preserve">scripts/deploy-remote.sh</w:t>
+      </w:r>
+      <w:r>
+        <w:t xml:space="preserve"> </w:t>
+      </w:r>
+      <w:r>
+        <w:t xml:space="preserve">+</w:t>
+      </w:r>
+      <w:r>
+        <w:t xml:space="preserve"> </w:t>
+      </w:r>
+      <w:r>
+        <w:rPr>
+          <w:rStyle w:val="VerbatimChar"/>
+        </w:rPr>
+        <w:t xml:space="preserve">deploy/remote-hosts.env.example</w:t>
+      </w:r>
+      <w:r>
+        <w:t xml:space="preserve">, and HEAVY-TESTED against real running production services —</w:t>
+      </w:r>
+      <w:r>
+        <w:t xml:space="preserve"> </w:t>
+      </w:r>
+      <w:r>
+        <w:rPr>
+          <w:b/>
+          <w:bCs/>
+        </w:rPr>
+        <w:t xml:space="preserve">captured evidence in</w:t>
+      </w:r>
+      <w:r>
+        <w:rPr>
+          <w:b/>
+          <w:bCs/>
+        </w:rPr>
+        <w:t xml:space="preserve"> </w:t>
+      </w:r>
+      <w:r>
+        <w:rPr>
+          <w:rStyle w:val="VerbatimChar"/>
+          <w:b/>
+          <w:bCs/>
+        </w:rPr>
+        <w:t xml:space="preserve">qa-results/nezha-heavytest-20260616/</w:t>
+      </w:r>
+      <w:r>
+        <w:t xml:space="preserve"> </w:t>
+      </w:r>
+      <w:r>
+        <w:t xml:space="preserve">(+ SUMMARY.md): run-tests scenario</w:t>
+      </w:r>
+      <w:r>
+        <w:t xml:space="preserve"> </w:t>
+      </w:r>
+      <w:r>
+        <w:rPr>
+          <w:b/>
+          <w:bCs/>
+        </w:rPr>
+        <w:t xml:space="preserve">17/0</w:t>
+      </w:r>
+      <w:r>
+        <w:t xml:space="preserve"> </w:t>
+      </w:r>
+      <w:r>
+        <w:t xml:space="preserve">+ integration</w:t>
+      </w:r>
+      <w:r>
+        <w:t xml:space="preserve"> </w:t>
+      </w:r>
+      <w:r>
+        <w:rPr>
+          <w:b/>
+          <w:bCs/>
+        </w:rPr>
+        <w:t xml:space="preserve">123/0</w:t>
+      </w:r>
+      <w:r>
+        <w:t xml:space="preserve"> </w:t>
+      </w:r>
+      <w:r>
+        <w:t xml:space="preserve">+ error</w:t>
+      </w:r>
+      <w:r>
+        <w:t xml:space="preserve"> </w:t>
+      </w:r>
+      <w:r>
+        <w:rPr>
+          <w:b/>
+          <w:bCs/>
+        </w:rPr>
+        <w:t xml:space="preserve">24/0</w:t>
+      </w:r>
+      <w:r>
+        <w:t xml:space="preserve">, container-restart PASS, chaos</w:t>
+      </w:r>
+      <w:r>
+        <w:t xml:space="preserve"> </w:t>
+      </w:r>
+      <w:r>
+        <w:rPr>
+          <w:b/>
+          <w:bCs/>
+        </w:rPr>
+        <w:t xml:space="preserve">27/0</w:t>
+      </w:r>
+      <w:r>
+        <w:t xml:space="preserve">/1skip(DNS), memory-limits PASS, smoke</w:t>
+      </w:r>
+      <w:r>
+        <w:t xml:space="preserve"> </w:t>
+      </w:r>
+      <w:r>
+        <w:rPr>
+          <w:b/>
+          <w:bCs/>
+        </w:rPr>
+        <w:t xml:space="preserve">22/0</w:t>
+      </w:r>
+      <w:r>
+        <w:t xml:space="preserve">, contract</w:t>
+      </w:r>
+      <w:r>
+        <w:t xml:space="preserve"> </w:t>
+      </w:r>
+      <w:r>
+        <w:rPr>
+          <w:b/>
+          <w:bCs/>
+        </w:rPr>
+        <w:t xml:space="preserve">18/0</w:t>
+      </w:r>
+      <w:r>
+        <w:t xml:space="preserve">, integration-realhttp</w:t>
+      </w:r>
+      <w:r>
+        <w:t xml:space="preserve"> </w:t>
+      </w:r>
+      <w:r>
+        <w:rPr>
+          <w:b/>
+          <w:bCs/>
+        </w:rPr>
+        <w:t xml:space="preserve">22/0</w:t>
+      </w:r>
+      <w:r>
+        <w:t xml:space="preserve">, 7/7 challenges (incl.</w:t>
+      </w:r>
+      <w:r>
+        <w:t xml:space="preserve"> </w:t>
+      </w:r>
+      <w:r>
+        <w:rPr>
+          <w:rStyle w:val="VerbatimChar"/>
+        </w:rPr>
+        <w:t xml:space="preserve">download_completes</w:t>
+      </w:r>
+      <w:r>
+        <w:t xml:space="preserve"> </w:t>
+      </w:r>
+      <w:r>
+        <w:t xml:space="preserve">→ a real</w:t>
+      </w:r>
+      <w:r>
+        <w:t xml:space="preserve"> </w:t>
+      </w:r>
+      <w:r>
+        <w:rPr>
+          <w:b/>
+          <w:bCs/>
+        </w:rPr>
+        <w:t xml:space="preserve">111 MB webready</w:t>
+      </w:r>
+      <w:r>
+        <w:t xml:space="preserve"> </w:t>
+      </w:r>
+      <w:r>
+        <w:t xml:space="preserve">file on disk), postprocessor pytest</w:t>
+      </w:r>
+      <w:r>
+        <w:t xml:space="preserve"> </w:t>
+      </w:r>
+      <w:r>
+        <w:rPr>
+          <w:b/>
+          <w:bCs/>
+        </w:rPr>
+        <w:t xml:space="preserve">46p/23skip/0fail</w:t>
+      </w:r>
+      <w:r>
+        <w:t xml:space="preserve">, dashboard 34/1(env), media-services 16/0, aborted-history 9/0, bulk 9/0.</w:t>
+      </w:r>
+      <w:r>
+        <w:t xml:space="preserve"> </w:t>
+      </w:r>
+      <w:r>
+        <w:rPr>
+          <w:b/>
+          <w:bCs/>
+        </w:rPr>
+        <w:t xml:space="preserve">Zero product bugs</w:t>
+      </w:r>
+      <w:r>
+        <w:t xml:space="preserve">; 6 deploy/test issues root-caused + fixed (§11.4.102, commits 5d15a64/f10c727/acbed76/b96dc8f). The 4 user surfaces were</w:t>
+      </w:r>
+      <w:r>
+        <w:t xml:space="preserve"> </w:t>
+      </w:r>
+      <w:r>
+        <w:rPr>
+          <w:b/>
+          <w:bCs/>
+        </w:rPr>
+        <w:t xml:space="preserve">re-recorded on nezha + re-read natively (4/4 PASS):</w:t>
+      </w:r>
+      <w:r>
+        <w:t xml:space="preserve"> </w:t>
+      </w:r>
+      <w:r>
+        <w:rPr>
+          <w:rStyle w:val="VerbatimChar"/>
+        </w:rPr>
+        <w:t xml:space="preserve">ytdlp---nezha-dashboard---20260616T135945Z.png</w:t>
+      </w:r>
+      <w:r>
+        <w:t xml:space="preserve"> </w:t>
+      </w:r>
+      <w:r>
+        <w:t xml:space="preserve">(full Add-Download UI + 16-platform grid),</w:t>
+      </w:r>
+      <w:r>
+        <w:t xml:space="preserve"> </w:t>
+      </w:r>
+      <w:r>
+        <w:rPr>
+          <w:rStyle w:val="VerbatimChar"/>
+        </w:rPr>
+        <w:t xml:space="preserve">ytdlp---nezha-metube---20260616T140007Z.png</w:t>
+      </w:r>
+      <w:r>
+        <w:t xml:space="preserve"> </w:t>
+      </w:r>
+      <w:r>
+        <w:t xml:space="preserve">(real fresh downloads "M5 Ultra Mac Studio Leaks…" 62.62 MB etc.),</w:t>
+      </w:r>
+      <w:r>
+        <w:t xml:space="preserve"> </w:t>
+      </w:r>
+      <w:r>
+        <w:rPr>
+          <w:rStyle w:val="VerbatimChar"/>
+        </w:rPr>
+        <w:t xml:space="preserve">ytdlp---nezha-postprocess---20260616T140014Z.png</w:t>
+      </w:r>
+      <w:r>
+        <w:t xml:space="preserve"> </w:t>
+      </w:r>
+      <w:r>
+        <w:t xml:space="preserve">(</w:t>
+      </w:r>
+      <w:r>
+        <w:rPr>
+          <w:rStyle w:val="VerbatimChar"/>
+        </w:rPr>
+        <w:t xml:space="preserve">{"healthy":true,...,"done":7,"failed":0}</w:t>
+      </w:r>
+      <w:r>
+        <w:t xml:space="preserve"> </w:t>
+      </w:r>
+      <w:r>
+        <w:t xml:space="preserve">— clean pipeline),</w:t>
+      </w:r>
+      <w:r>
+        <w:t xml:space="preserve"> </w:t>
+      </w:r>
+      <w:r>
+        <w:rPr>
+          <w:rStyle w:val="VerbatimChar"/>
+        </w:rPr>
+        <w:t xml:space="preserve">ytdlp---nezha-landing---20260616T140001Z.png</w:t>
+      </w:r>
+      <w:r>
+        <w:t xml:space="preserve"> </w:t>
+      </w:r>
+      <w:r>
+        <w:t xml:space="preserve">(the :8086→:9090 auto-redirect fired, as designed). The §1 services + §3 CLI scripts + §6 test/challenge suites are therefore now backed by captured green runs on a REAL Linux+Podman production host (the heavy container-lifecycle suites that could NOT run on the Mac).</w:t>
       </w:r>
     </w:p>
     <w:p>

</xml_diff>